<commit_message>
Kundendokument auf die gestaffelte Hauptpreis-Sperre nachgezogen
Abschnitt 2 zeigt jetzt drei Tabellen (Freitag, Samstag, Sonntag) statt
"Samstag" und "Freitag und Sonntag"; die Klick-Szenarien richten sich nach
der Oeffnungsdauer des jeweiligen Tages (Fr 60/100/150, Sa 150/250/400,
So 100/150/250). Zahlen neu simuliert, je 500 Messetage.

Abschnitt 3 nennt die Sperre je Messetag samt Nachweis statt "ab dem 151.
Klick" fuer alle Tage: Fr ab Klick 61, Sa ab 151, So ab 101.

Abschnitt 5 nennt zusaetzlich die Beamer-Adresse.

Co-Authored-By: Claude Opus 5 (1M context) <noreply@anthropic.com>
Claude-Session: https://claude.ai/code/session_01761TbYcyMNr4fdPVQrzgqd
</commit_message>
<xml_diff>
--- a/glueckrad/Bruesch-Gluecksrad-Uebersicht.docx
+++ b/glueckrad/Bruesch-Gluecksrad-Uebersicht.docx
@@ -732,7 +732,7 @@
           <w:i w:val="0"/>
           <w:sz w:val="21"/>
         </w:rPr>
-        <w:t>Wie viel herausgeht, hängt davon ab, wie oft der Buzzer gedrückt wird. Die Kontingente oben werden bei üblichem Andrang bei Weitem nicht ausgeschöpft. Mittelwerte aus je 20 simulierten Messetagen:</w:t>
+        <w:t>Wie viel herausgeht, hängt davon ab, wie oft der Buzzer gedrückt wird. Die Kontingente oben werden bei üblichem Andrang bei Weitem nicht ausgeschöpft. Die Klickzahlen sind je Messetag auf die Öffnungsdauer abgestimmt – am Freitag ist die Ausstellung vier Stunden offen, am Samstag elf. Mittelwerte aus je 500 simulierten Messetagen:</w:t>
       </w:r>
     </w:p>
     <w:p>
@@ -745,7 +745,7 @@
           <w:color w:val="23272A"/>
           <w:sz w:val="22"/>
         </w:rPr>
-        <w:t>Samstag</w:t>
+        <w:t>Freitag · 17–21 Uhr (4 Stunden)</w:t>
       </w:r>
     </w:p>
     <w:tbl>
@@ -769,14 +769,15 @@
             <w:shd w:fill="2E7D33"/>
           </w:tcPr>
           <w:p>
-            <w:r/>
+            <w:r>
+              <w:t>Artikel</w:t>
+            </w:r>
             <w:r>
               <w:rPr>
                 <w:b/>
                 <w:color w:val="FFFFFF"/>
                 <w:sz w:val="19"/>
               </w:rPr>
-              <w:t>Artikel</w:t>
             </w:r>
           </w:p>
         </w:tc>
@@ -789,14 +790,15 @@
             <w:pPr>
               <w:jc w:val="right"/>
             </w:pPr>
-            <w:r/>
+            <w:r>
+              <w:t>hinterlegt</w:t>
+            </w:r>
             <w:r>
               <w:rPr>
                 <w:b/>
                 <w:color w:val="FFFFFF"/>
                 <w:sz w:val="19"/>
               </w:rPr>
-              <w:t>hinterlegt</w:t>
             </w:r>
           </w:p>
         </w:tc>
@@ -809,14 +811,15 @@
             <w:pPr>
               <w:jc w:val="right"/>
             </w:pPr>
-            <w:r/>
+            <w:r>
+              <w:t>60 Klicks</w:t>
+            </w:r>
             <w:r>
               <w:rPr>
                 <w:b/>
                 <w:color w:val="FFFFFF"/>
                 <w:sz w:val="19"/>
               </w:rPr>
-              <w:t>150 Klicks</w:t>
             </w:r>
           </w:p>
         </w:tc>
@@ -829,14 +832,15 @@
             <w:pPr>
               <w:jc w:val="right"/>
             </w:pPr>
-            <w:r/>
+            <w:r>
+              <w:t>100 Klicks</w:t>
+            </w:r>
             <w:r>
               <w:rPr>
                 <w:b/>
                 <w:color w:val="FFFFFF"/>
                 <w:sz w:val="19"/>
               </w:rPr>
-              <w:t>200 Klicks</w:t>
             </w:r>
           </w:p>
         </w:tc>
@@ -849,14 +853,15 @@
             <w:pPr>
               <w:jc w:val="right"/>
             </w:pPr>
-            <w:r/>
+            <w:r>
+              <w:t>150 Klicks</w:t>
+            </w:r>
             <w:r>
               <w:rPr>
                 <w:b/>
                 <w:color w:val="FFFFFF"/>
                 <w:sz w:val="19"/>
               </w:rPr>
-              <w:t>300 Klicks</w:t>
             </w:r>
           </w:p>
         </w:tc>
@@ -867,13 +872,14 @@
             <w:tcW w:type="dxa" w:w="3402"/>
           </w:tcPr>
           <w:p>
-            <w:r/>
+            <w:r>
+              <w:t>Hauptpreis Kinogutschein</w:t>
+            </w:r>
             <w:r>
               <w:rPr>
                 <w:b/>
                 <w:sz w:val="20"/>
               </w:rPr>
-              <w:t>Hauptpreis Kinogutschein</w:t>
             </w:r>
           </w:p>
         </w:tc>
@@ -885,12 +891,13 @@
             <w:pPr>
               <w:jc w:val="right"/>
             </w:pPr>
-            <w:r/>
+            <w:r>
+              <w:t>1</w:t>
+            </w:r>
             <w:r>
               <w:rPr>
                 <w:sz w:val="20"/>
               </w:rPr>
-              <w:t>1</w:t>
             </w:r>
           </w:p>
         </w:tc>
@@ -902,12 +909,13 @@
             <w:pPr>
               <w:jc w:val="right"/>
             </w:pPr>
-            <w:r/>
+            <w:r>
+              <w:t>0</w:t>
+            </w:r>
             <w:r>
               <w:rPr>
                 <w:sz w:val="20"/>
               </w:rPr>
-              <w:t>0</w:t>
             </w:r>
           </w:p>
         </w:tc>
@@ -919,12 +927,13 @@
             <w:pPr>
               <w:jc w:val="right"/>
             </w:pPr>
-            <w:r/>
+            <w:r>
+              <w:t>1</w:t>
+            </w:r>
             <w:r>
               <w:rPr>
                 <w:sz w:val="20"/>
               </w:rPr>
-              <w:t>1</w:t>
             </w:r>
           </w:p>
         </w:tc>
@@ -936,12 +945,13 @@
             <w:pPr>
               <w:jc w:val="right"/>
             </w:pPr>
-            <w:r/>
+            <w:r>
+              <w:t>1</w:t>
+            </w:r>
             <w:r>
               <w:rPr>
                 <w:sz w:val="20"/>
               </w:rPr>
-              <w:t>1</w:t>
             </w:r>
           </w:p>
         </w:tc>
@@ -953,13 +963,14 @@
             <w:shd w:fill="F2F6F2"/>
           </w:tcPr>
           <w:p>
-            <w:r/>
+            <w:r>
+              <w:t>Kugelschreiber</w:t>
+            </w:r>
             <w:r>
               <w:rPr>
                 <w:b/>
                 <w:sz w:val="20"/>
               </w:rPr>
-              <w:t>Kugelschreiber</w:t>
             </w:r>
           </w:p>
         </w:tc>
@@ -972,12 +983,13 @@
             <w:pPr>
               <w:jc w:val="right"/>
             </w:pPr>
-            <w:r/>
+            <w:r>
+              <w:t>100</w:t>
+            </w:r>
             <w:r>
               <w:rPr>
                 <w:sz w:val="20"/>
               </w:rPr>
-              <w:t>200</w:t>
             </w:r>
           </w:p>
         </w:tc>
@@ -990,12 +1002,13 @@
             <w:pPr>
               <w:jc w:val="right"/>
             </w:pPr>
-            <w:r/>
+            <w:r>
+              <w:t>21</w:t>
+            </w:r>
             <w:r>
               <w:rPr>
                 <w:sz w:val="20"/>
               </w:rPr>
-              <w:t>59</w:t>
             </w:r>
           </w:p>
         </w:tc>
@@ -1008,12 +1021,13 @@
             <w:pPr>
               <w:jc w:val="right"/>
             </w:pPr>
-            <w:r/>
+            <w:r>
+              <w:t>34</w:t>
+            </w:r>
             <w:r>
               <w:rPr>
                 <w:sz w:val="20"/>
               </w:rPr>
-              <w:t>77</w:t>
             </w:r>
           </w:p>
         </w:tc>
@@ -1026,12 +1040,13 @@
             <w:pPr>
               <w:jc w:val="right"/>
             </w:pPr>
-            <w:r/>
+            <w:r>
+              <w:t>50</w:t>
+            </w:r>
             <w:r>
               <w:rPr>
                 <w:sz w:val="20"/>
               </w:rPr>
-              <w:t>114</w:t>
             </w:r>
           </w:p>
         </w:tc>
@@ -1042,13 +1057,14 @@
             <w:tcW w:type="dxa" w:w="3402"/>
           </w:tcPr>
           <w:p>
-            <w:r/>
+            <w:r>
+              <w:t>Trinkflasche</w:t>
+            </w:r>
             <w:r>
               <w:rPr>
                 <w:b/>
                 <w:sz w:val="20"/>
               </w:rPr>
-              <w:t>Trinkflasche</w:t>
             </w:r>
           </w:p>
         </w:tc>
@@ -1060,12 +1076,13 @@
             <w:pPr>
               <w:jc w:val="right"/>
             </w:pPr>
-            <w:r/>
+            <w:r>
+              <w:t>50</w:t>
+            </w:r>
             <w:r>
               <w:rPr>
                 <w:sz w:val="20"/>
               </w:rPr>
-              <w:t>100</w:t>
             </w:r>
           </w:p>
         </w:tc>
@@ -1077,12 +1094,13 @@
             <w:pPr>
               <w:jc w:val="right"/>
             </w:pPr>
-            <w:r/>
+            <w:r>
+              <w:t>11</w:t>
+            </w:r>
             <w:r>
               <w:rPr>
                 <w:sz w:val="20"/>
               </w:rPr>
-              <w:t>30</w:t>
             </w:r>
           </w:p>
         </w:tc>
@@ -1094,12 +1112,13 @@
             <w:pPr>
               <w:jc w:val="right"/>
             </w:pPr>
-            <w:r/>
+            <w:r>
+              <w:t>17</w:t>
+            </w:r>
             <w:r>
               <w:rPr>
                 <w:sz w:val="20"/>
               </w:rPr>
-              <w:t>37</w:t>
             </w:r>
           </w:p>
         </w:tc>
@@ -1111,12 +1130,13 @@
             <w:pPr>
               <w:jc w:val="right"/>
             </w:pPr>
-            <w:r/>
+            <w:r>
+              <w:t>25</w:t>
+            </w:r>
             <w:r>
               <w:rPr>
                 <w:sz w:val="20"/>
               </w:rPr>
-              <w:t>57</w:t>
             </w:r>
           </w:p>
         </w:tc>
@@ -1128,13 +1148,14 @@
             <w:shd w:fill="F2F6F2"/>
           </w:tcPr>
           <w:p>
-            <w:r/>
+            <w:r>
+              <w:t>Kühl-/Wärme-Pad</w:t>
+            </w:r>
             <w:r>
               <w:rPr>
                 <w:b/>
                 <w:sz w:val="20"/>
               </w:rPr>
-              <w:t>Kühl-/Wärme-Pad</w:t>
             </w:r>
           </w:p>
         </w:tc>
@@ -1147,12 +1168,13 @@
             <w:pPr>
               <w:jc w:val="right"/>
             </w:pPr>
-            <w:r/>
+            <w:r>
+              <w:t>50</w:t>
+            </w:r>
             <w:r>
               <w:rPr>
                 <w:sz w:val="20"/>
               </w:rPr>
-              <w:t>100</w:t>
             </w:r>
           </w:p>
         </w:tc>
@@ -1165,12 +1187,13 @@
             <w:pPr>
               <w:jc w:val="right"/>
             </w:pPr>
-            <w:r/>
+            <w:r>
+              <w:t>11</w:t>
+            </w:r>
             <w:r>
               <w:rPr>
                 <w:sz w:val="20"/>
               </w:rPr>
-              <w:t>28</w:t>
             </w:r>
           </w:p>
         </w:tc>
@@ -1183,12 +1206,13 @@
             <w:pPr>
               <w:jc w:val="right"/>
             </w:pPr>
-            <w:r/>
+            <w:r>
+              <w:t>17</w:t>
+            </w:r>
             <w:r>
               <w:rPr>
                 <w:sz w:val="20"/>
               </w:rPr>
-              <w:t>38</w:t>
             </w:r>
           </w:p>
         </w:tc>
@@ -1201,12 +1225,13 @@
             <w:pPr>
               <w:jc w:val="right"/>
             </w:pPr>
-            <w:r/>
+            <w:r>
+              <w:t>25</w:t>
+            </w:r>
             <w:r>
               <w:rPr>
                 <w:sz w:val="20"/>
               </w:rPr>
-              <w:t>57</w:t>
             </w:r>
           </w:p>
         </w:tc>
@@ -1217,13 +1242,14 @@
             <w:tcW w:type="dxa" w:w="3402"/>
           </w:tcPr>
           <w:p>
-            <w:r/>
+            <w:r>
+              <w:t>GreenTEA</w:t>
+            </w:r>
             <w:r>
               <w:rPr>
                 <w:b/>
                 <w:sz w:val="20"/>
               </w:rPr>
-              <w:t>GreenTEA</w:t>
             </w:r>
           </w:p>
         </w:tc>
@@ -1235,12 +1261,13 @@
             <w:pPr>
               <w:jc w:val="right"/>
             </w:pPr>
-            <w:r/>
+            <w:r>
+              <w:t>unbegrenzt</w:t>
+            </w:r>
             <w:r>
               <w:rPr>
                 <w:sz w:val="20"/>
               </w:rPr>
-              <w:t>unbegrenzt</w:t>
             </w:r>
           </w:p>
         </w:tc>
@@ -1252,12 +1279,13 @@
             <w:pPr>
               <w:jc w:val="right"/>
             </w:pPr>
-            <w:r/>
+            <w:r>
+              <w:t>12</w:t>
+            </w:r>
             <w:r>
               <w:rPr>
                 <w:sz w:val="20"/>
               </w:rPr>
-              <w:t>18</w:t>
             </w:r>
           </w:p>
         </w:tc>
@@ -1269,12 +1297,13 @@
             <w:pPr>
               <w:jc w:val="right"/>
             </w:pPr>
-            <w:r/>
+            <w:r>
+              <w:t>21</w:t>
+            </w:r>
             <w:r>
               <w:rPr>
                 <w:sz w:val="20"/>
               </w:rPr>
-              <w:t>25</w:t>
             </w:r>
           </w:p>
         </w:tc>
@@ -1286,12 +1315,13 @@
             <w:pPr>
               <w:jc w:val="right"/>
             </w:pPr>
-            <w:r/>
+            <w:r>
+              <w:t>34</w:t>
+            </w:r>
             <w:r>
               <w:rPr>
                 <w:sz w:val="20"/>
               </w:rPr>
-              <w:t>40</w:t>
             </w:r>
           </w:p>
         </w:tc>
@@ -1303,13 +1333,14 @@
             <w:shd w:fill="F2F6F2"/>
           </w:tcPr>
           <w:p>
-            <w:r/>
+            <w:r>
+              <w:t>Niete</w:t>
+            </w:r>
             <w:r>
               <w:rPr>
                 <w:b/>
                 <w:sz w:val="20"/>
               </w:rPr>
-              <w:t>Niete</w:t>
             </w:r>
           </w:p>
         </w:tc>
@@ -1322,12 +1353,13 @@
             <w:pPr>
               <w:jc w:val="right"/>
             </w:pPr>
-            <w:r/>
+            <w:r>
+              <w:t>–</w:t>
+            </w:r>
             <w:r>
               <w:rPr>
                 <w:sz w:val="20"/>
               </w:rPr>
-              <w:t>–</w:t>
             </w:r>
           </w:p>
         </w:tc>
@@ -1340,12 +1372,13 @@
             <w:pPr>
               <w:jc w:val="right"/>
             </w:pPr>
-            <w:r/>
+            <w:r>
+              <w:t>6</w:t>
+            </w:r>
             <w:r>
               <w:rPr>
                 <w:sz w:val="20"/>
               </w:rPr>
-              <w:t>15</w:t>
             </w:r>
           </w:p>
         </w:tc>
@@ -1358,12 +1391,13 @@
             <w:pPr>
               <w:jc w:val="right"/>
             </w:pPr>
-            <w:r/>
+            <w:r>
+              <w:t>10</w:t>
+            </w:r>
             <w:r>
               <w:rPr>
                 <w:sz w:val="20"/>
               </w:rPr>
-              <w:t>21</w:t>
             </w:r>
           </w:p>
         </w:tc>
@@ -1376,12 +1410,13 @@
             <w:pPr>
               <w:jc w:val="right"/>
             </w:pPr>
-            <w:r/>
+            <w:r>
+              <w:t>15</w:t>
+            </w:r>
             <w:r>
               <w:rPr>
                 <w:sz w:val="20"/>
               </w:rPr>
-              <w:t>31</w:t>
             </w:r>
           </w:p>
         </w:tc>
@@ -1402,7 +1437,7 @@
           <w:color w:val="23272A"/>
           <w:sz w:val="22"/>
         </w:rPr>
-        <w:t>Freitag und Sonntag</w:t>
+        <w:t>Samstag · 10–21 Uhr (11 Stunden)</w:t>
       </w:r>
     </w:p>
     <w:tbl>
@@ -1426,14 +1461,15 @@
             <w:shd w:fill="2E7D33"/>
           </w:tcPr>
           <w:p>
-            <w:r/>
+            <w:r>
+              <w:t>Artikel</w:t>
+            </w:r>
             <w:r>
               <w:rPr>
                 <w:b/>
                 <w:color w:val="FFFFFF"/>
                 <w:sz w:val="19"/>
               </w:rPr>
-              <w:t>Artikel</w:t>
             </w:r>
           </w:p>
         </w:tc>
@@ -1446,14 +1482,15 @@
             <w:pPr>
               <w:jc w:val="right"/>
             </w:pPr>
-            <w:r/>
+            <w:r>
+              <w:t>hinterlegt</w:t>
+            </w:r>
             <w:r>
               <w:rPr>
                 <w:b/>
                 <w:color w:val="FFFFFF"/>
                 <w:sz w:val="19"/>
               </w:rPr>
-              <w:t>hinterlegt</w:t>
             </w:r>
           </w:p>
         </w:tc>
@@ -1466,14 +1503,15 @@
             <w:pPr>
               <w:jc w:val="right"/>
             </w:pPr>
-            <w:r/>
+            <w:r>
+              <w:t>150 Klicks</w:t>
+            </w:r>
             <w:r>
               <w:rPr>
                 <w:b/>
                 <w:color w:val="FFFFFF"/>
                 <w:sz w:val="19"/>
               </w:rPr>
-              <w:t>150 Klicks</w:t>
             </w:r>
           </w:p>
         </w:tc>
@@ -1486,14 +1524,15 @@
             <w:pPr>
               <w:jc w:val="right"/>
             </w:pPr>
-            <w:r/>
+            <w:r>
+              <w:t>250 Klicks</w:t>
+            </w:r>
             <w:r>
               <w:rPr>
                 <w:b/>
                 <w:color w:val="FFFFFF"/>
                 <w:sz w:val="19"/>
               </w:rPr>
-              <w:t>200 Klicks</w:t>
             </w:r>
           </w:p>
         </w:tc>
@@ -1506,14 +1545,15 @@
             <w:pPr>
               <w:jc w:val="right"/>
             </w:pPr>
-            <w:r/>
+            <w:r>
+              <w:t>400 Klicks</w:t>
+            </w:r>
             <w:r>
               <w:rPr>
                 <w:b/>
                 <w:color w:val="FFFFFF"/>
                 <w:sz w:val="19"/>
               </w:rPr>
-              <w:t>300 Klicks</w:t>
             </w:r>
           </w:p>
         </w:tc>
@@ -1524,13 +1564,14 @@
             <w:tcW w:type="dxa" w:w="3402"/>
           </w:tcPr>
           <w:p>
-            <w:r/>
+            <w:r>
+              <w:t>Hauptpreis Kinogutschein</w:t>
+            </w:r>
             <w:r>
               <w:rPr>
                 <w:b/>
                 <w:sz w:val="20"/>
               </w:rPr>
-              <w:t>Hauptpreis Kinogutschein</w:t>
             </w:r>
           </w:p>
         </w:tc>
@@ -1542,12 +1583,13 @@
             <w:pPr>
               <w:jc w:val="right"/>
             </w:pPr>
-            <w:r/>
+            <w:r>
+              <w:t>1</w:t>
+            </w:r>
             <w:r>
               <w:rPr>
                 <w:sz w:val="20"/>
               </w:rPr>
-              <w:t>1</w:t>
             </w:r>
           </w:p>
         </w:tc>
@@ -1559,12 +1601,13 @@
             <w:pPr>
               <w:jc w:val="right"/>
             </w:pPr>
-            <w:r/>
+            <w:r>
+              <w:t>0</w:t>
+            </w:r>
             <w:r>
               <w:rPr>
                 <w:sz w:val="20"/>
               </w:rPr>
-              <w:t>0</w:t>
             </w:r>
           </w:p>
         </w:tc>
@@ -1576,12 +1619,13 @@
             <w:pPr>
               <w:jc w:val="right"/>
             </w:pPr>
-            <w:r/>
+            <w:r>
+              <w:t>1</w:t>
+            </w:r>
             <w:r>
               <w:rPr>
                 <w:sz w:val="20"/>
               </w:rPr>
-              <w:t>1</w:t>
             </w:r>
           </w:p>
         </w:tc>
@@ -1593,12 +1637,13 @@
             <w:pPr>
               <w:jc w:val="right"/>
             </w:pPr>
-            <w:r/>
+            <w:r>
+              <w:t>1</w:t>
+            </w:r>
             <w:r>
               <w:rPr>
                 <w:sz w:val="20"/>
               </w:rPr>
-              <w:t>1</w:t>
             </w:r>
           </w:p>
         </w:tc>
@@ -1610,13 +1655,14 @@
             <w:shd w:fill="F2F6F2"/>
           </w:tcPr>
           <w:p>
-            <w:r/>
+            <w:r>
+              <w:t>Kugelschreiber</w:t>
+            </w:r>
             <w:r>
               <w:rPr>
                 <w:b/>
                 <w:sz w:val="20"/>
               </w:rPr>
-              <w:t>Kugelschreiber</w:t>
             </w:r>
           </w:p>
         </w:tc>
@@ -1629,12 +1675,13 @@
             <w:pPr>
               <w:jc w:val="right"/>
             </w:pPr>
-            <w:r/>
+            <w:r>
+              <w:t>200</w:t>
+            </w:r>
             <w:r>
               <w:rPr>
                 <w:sz w:val="20"/>
               </w:rPr>
-              <w:t>100</w:t>
             </w:r>
           </w:p>
         </w:tc>
@@ -1647,12 +1694,13 @@
             <w:pPr>
               <w:jc w:val="right"/>
             </w:pPr>
-            <w:r/>
+            <w:r>
+              <w:t>59</w:t>
+            </w:r>
             <w:r>
               <w:rPr>
                 <w:sz w:val="20"/>
               </w:rPr>
-              <w:t>50</w:t>
             </w:r>
           </w:p>
         </w:tc>
@@ -1665,12 +1713,13 @@
             <w:pPr>
               <w:jc w:val="right"/>
             </w:pPr>
-            <w:r/>
+            <w:r>
+              <w:t>96</w:t>
+            </w:r>
             <w:r>
               <w:rPr>
                 <w:sz w:val="20"/>
               </w:rPr>
-              <w:t>62</w:t>
             </w:r>
           </w:p>
         </w:tc>
@@ -1683,12 +1732,13 @@
             <w:pPr>
               <w:jc w:val="right"/>
             </w:pPr>
-            <w:r/>
+            <w:r>
+              <w:t>147</w:t>
+            </w:r>
             <w:r>
               <w:rPr>
                 <w:sz w:val="20"/>
               </w:rPr>
-              <w:t>85</w:t>
             </w:r>
           </w:p>
         </w:tc>
@@ -1699,13 +1749,14 @@
             <w:tcW w:type="dxa" w:w="3402"/>
           </w:tcPr>
           <w:p>
-            <w:r/>
+            <w:r>
+              <w:t>Trinkflasche</w:t>
+            </w:r>
             <w:r>
               <w:rPr>
                 <w:b/>
                 <w:sz w:val="20"/>
               </w:rPr>
-              <w:t>Trinkflasche</w:t>
             </w:r>
           </w:p>
         </w:tc>
@@ -1717,12 +1768,13 @@
             <w:pPr>
               <w:jc w:val="right"/>
             </w:pPr>
-            <w:r/>
+            <w:r>
+              <w:t>100</w:t>
+            </w:r>
             <w:r>
               <w:rPr>
                 <w:sz w:val="20"/>
               </w:rPr>
-              <w:t>50</w:t>
             </w:r>
           </w:p>
         </w:tc>
@@ -1734,12 +1786,13 @@
             <w:pPr>
               <w:jc w:val="right"/>
             </w:pPr>
-            <w:r/>
+            <w:r>
+              <w:t>29</w:t>
+            </w:r>
             <w:r>
               <w:rPr>
                 <w:sz w:val="20"/>
               </w:rPr>
-              <w:t>26</w:t>
             </w:r>
           </w:p>
         </w:tc>
@@ -1751,12 +1804,13 @@
             <w:pPr>
               <w:jc w:val="right"/>
             </w:pPr>
-            <w:r/>
+            <w:r>
+              <w:t>48</w:t>
+            </w:r>
             <w:r>
               <w:rPr>
                 <w:sz w:val="20"/>
               </w:rPr>
-              <w:t>32</w:t>
             </w:r>
           </w:p>
         </w:tc>
@@ -1768,12 +1822,13 @@
             <w:pPr>
               <w:jc w:val="right"/>
             </w:pPr>
-            <w:r/>
+            <w:r>
+              <w:t>73</w:t>
+            </w:r>
             <w:r>
               <w:rPr>
                 <w:sz w:val="20"/>
               </w:rPr>
-              <w:t>42</w:t>
             </w:r>
           </w:p>
         </w:tc>
@@ -1785,13 +1840,14 @@
             <w:shd w:fill="F2F6F2"/>
           </w:tcPr>
           <w:p>
-            <w:r/>
+            <w:r>
+              <w:t>Kühl-/Wärme-Pad</w:t>
+            </w:r>
             <w:r>
               <w:rPr>
                 <w:b/>
                 <w:sz w:val="20"/>
               </w:rPr>
-              <w:t>Kühl-/Wärme-Pad</w:t>
             </w:r>
           </w:p>
         </w:tc>
@@ -1804,12 +1860,13 @@
             <w:pPr>
               <w:jc w:val="right"/>
             </w:pPr>
-            <w:r/>
+            <w:r>
+              <w:t>100</w:t>
+            </w:r>
             <w:r>
               <w:rPr>
                 <w:sz w:val="20"/>
               </w:rPr>
-              <w:t>50</w:t>
             </w:r>
           </w:p>
         </w:tc>
@@ -1822,12 +1879,13 @@
             <w:pPr>
               <w:jc w:val="right"/>
             </w:pPr>
-            <w:r/>
+            <w:r>
+              <w:t>29</w:t>
+            </w:r>
             <w:r>
               <w:rPr>
                 <w:sz w:val="20"/>
               </w:rPr>
-              <w:t>26</w:t>
             </w:r>
           </w:p>
         </w:tc>
@@ -1840,12 +1898,13 @@
             <w:pPr>
               <w:jc w:val="right"/>
             </w:pPr>
-            <w:r/>
+            <w:r>
+              <w:t>48</w:t>
+            </w:r>
             <w:r>
               <w:rPr>
                 <w:sz w:val="20"/>
               </w:rPr>
-              <w:t>33</w:t>
             </w:r>
           </w:p>
         </w:tc>
@@ -1858,12 +1917,13 @@
             <w:pPr>
               <w:jc w:val="right"/>
             </w:pPr>
-            <w:r/>
+            <w:r>
+              <w:t>73</w:t>
+            </w:r>
             <w:r>
               <w:rPr>
                 <w:sz w:val="20"/>
               </w:rPr>
-              <w:t>43</w:t>
             </w:r>
           </w:p>
         </w:tc>
@@ -1874,13 +1934,14 @@
             <w:tcW w:type="dxa" w:w="3402"/>
           </w:tcPr>
           <w:p>
-            <w:r/>
+            <w:r>
+              <w:t>GreenTEA</w:t>
+            </w:r>
             <w:r>
               <w:rPr>
                 <w:b/>
                 <w:sz w:val="20"/>
               </w:rPr>
-              <w:t>GreenTEA</w:t>
             </w:r>
           </w:p>
         </w:tc>
@@ -1892,12 +1953,13 @@
             <w:pPr>
               <w:jc w:val="right"/>
             </w:pPr>
-            <w:r/>
+            <w:r>
+              <w:t>unbegrenzt</w:t>
+            </w:r>
             <w:r>
               <w:rPr>
                 <w:sz w:val="20"/>
               </w:rPr>
-              <w:t>unbegrenzt</w:t>
             </w:r>
           </w:p>
         </w:tc>
@@ -1909,12 +1971,13 @@
             <w:pPr>
               <w:jc w:val="right"/>
             </w:pPr>
-            <w:r/>
+            <w:r>
+              <w:t>17</w:t>
+            </w:r>
             <w:r>
               <w:rPr>
                 <w:sz w:val="20"/>
               </w:rPr>
-              <w:t>35</w:t>
             </w:r>
           </w:p>
         </w:tc>
@@ -1926,12 +1989,13 @@
             <w:pPr>
               <w:jc w:val="right"/>
             </w:pPr>
-            <w:r/>
+            <w:r>
+              <w:t>33</w:t>
+            </w:r>
             <w:r>
               <w:rPr>
                 <w:sz w:val="20"/>
               </w:rPr>
-              <w:t>51</w:t>
             </w:r>
           </w:p>
         </w:tc>
@@ -1943,12 +2007,13 @@
             <w:pPr>
               <w:jc w:val="right"/>
             </w:pPr>
-            <w:r/>
+            <w:r>
+              <w:t>66</w:t>
+            </w:r>
             <w:r>
               <w:rPr>
                 <w:sz w:val="20"/>
               </w:rPr>
-              <w:t>99</w:t>
             </w:r>
           </w:p>
         </w:tc>
@@ -1960,13 +2025,14 @@
             <w:shd w:fill="F2F6F2"/>
           </w:tcPr>
           <w:p>
-            <w:r/>
+            <w:r>
+              <w:t>Niete</w:t>
+            </w:r>
             <w:r>
               <w:rPr>
                 <w:b/>
                 <w:sz w:val="20"/>
               </w:rPr>
-              <w:t>Niete</w:t>
             </w:r>
           </w:p>
         </w:tc>
@@ -1979,12 +2045,13 @@
             <w:pPr>
               <w:jc w:val="right"/>
             </w:pPr>
-            <w:r/>
+            <w:r>
+              <w:t>–</w:t>
+            </w:r>
             <w:r>
               <w:rPr>
                 <w:sz w:val="20"/>
               </w:rPr>
-              <w:t>–</w:t>
             </w:r>
           </w:p>
         </w:tc>
@@ -1997,12 +2064,13 @@
             <w:pPr>
               <w:jc w:val="right"/>
             </w:pPr>
-            <w:r/>
+            <w:r>
+              <w:t>15</w:t>
+            </w:r>
             <w:r>
               <w:rPr>
                 <w:sz w:val="20"/>
               </w:rPr>
-              <w:t>14</w:t>
             </w:r>
           </w:p>
         </w:tc>
@@ -2015,12 +2083,13 @@
             <w:pPr>
               <w:jc w:val="right"/>
             </w:pPr>
-            <w:r/>
+            <w:r>
+              <w:t>25</w:t>
+            </w:r>
             <w:r>
               <w:rPr>
                 <w:sz w:val="20"/>
               </w:rPr>
-              <w:t>21</w:t>
             </w:r>
           </w:p>
         </w:tc>
@@ -2033,12 +2102,705 @@
             <w:pPr>
               <w:jc w:val="right"/>
             </w:pPr>
-            <w:r/>
+            <w:r>
+              <w:t>40</w:t>
+            </w:r>
             <w:r>
               <w:rPr>
                 <w:sz w:val="20"/>
               </w:rPr>
-              <w:t>30</w:t>
+            </w:r>
+          </w:p>
+        </w:tc>
+      </w:tr>
+    </w:tbl>
+    <w:p>
+      <w:pPr>
+        <w:spacing w:after="40"/>
+      </w:pPr>
+    </w:p>
+    <w:p>
+      <w:pPr>
+        <w:spacing w:after="80"/>
+      </w:pPr>
+      <w:r>
+        <w:rPr>
+          <w:i w:val="0"/>
+          <w:color w:val="23272A"/>
+          <w:sz w:val="22"/>
+        </w:rPr>
+        <w:t>Sonntag · 10–17 Uhr (7 Stunden)</w:t>
+      </w:r>
+    </w:p>
+    <w:tbl>
+      <w:tblPr>
+        <w:tblStyle w:val="TableGrid"/>
+        <w:tblW w:type="auto" w:w="0"/>
+        <w:jc w:val="left"/>
+        <w:tblLook w:firstColumn="1" w:firstRow="1" w:lastColumn="0" w:lastRow="0" w:noHBand="0" w:noVBand="1" w:val="04A0"/>
+      </w:tblPr>
+      <w:tblGrid>
+        <w:gridCol w:w="1949"/>
+        <w:gridCol w:w="1949"/>
+        <w:gridCol w:w="1949"/>
+        <w:gridCol w:w="1949"/>
+        <w:gridCol w:w="1949"/>
+      </w:tblGrid>
+      <w:tr>
+        <w:tc>
+          <w:tcPr>
+            <w:tcW w:type="dxa" w:w="3402"/>
+            <w:shd w:fill="2E7D33"/>
+          </w:tcPr>
+          <w:p>
+            <w:r>
+              <w:t>Artikel</w:t>
+            </w:r>
+            <w:r>
+              <w:rPr>
+                <w:b/>
+                <w:color w:val="FFFFFF"/>
+                <w:sz w:val="19"/>
+              </w:rPr>
+            </w:r>
+          </w:p>
+        </w:tc>
+        <w:tc>
+          <w:tcPr>
+            <w:tcW w:type="dxa" w:w="1587"/>
+            <w:shd w:fill="2E7D33"/>
+          </w:tcPr>
+          <w:p>
+            <w:pPr>
+              <w:jc w:val="right"/>
+            </w:pPr>
+            <w:r>
+              <w:t>hinterlegt</w:t>
+            </w:r>
+            <w:r>
+              <w:rPr>
+                <w:b/>
+                <w:color w:val="FFFFFF"/>
+                <w:sz w:val="19"/>
+              </w:rPr>
+            </w:r>
+          </w:p>
+        </w:tc>
+        <w:tc>
+          <w:tcPr>
+            <w:tcW w:type="dxa" w:w="1474"/>
+            <w:shd w:fill="2E7D33"/>
+          </w:tcPr>
+          <w:p>
+            <w:pPr>
+              <w:jc w:val="right"/>
+            </w:pPr>
+            <w:r>
+              <w:t>100 Klicks</w:t>
+            </w:r>
+            <w:r>
+              <w:rPr>
+                <w:b/>
+                <w:color w:val="FFFFFF"/>
+                <w:sz w:val="19"/>
+              </w:rPr>
+            </w:r>
+          </w:p>
+        </w:tc>
+        <w:tc>
+          <w:tcPr>
+            <w:tcW w:type="dxa" w:w="1474"/>
+            <w:shd w:fill="2E7D33"/>
+          </w:tcPr>
+          <w:p>
+            <w:pPr>
+              <w:jc w:val="right"/>
+            </w:pPr>
+            <w:r>
+              <w:t>150 Klicks</w:t>
+            </w:r>
+            <w:r>
+              <w:rPr>
+                <w:b/>
+                <w:color w:val="FFFFFF"/>
+                <w:sz w:val="19"/>
+              </w:rPr>
+            </w:r>
+          </w:p>
+        </w:tc>
+        <w:tc>
+          <w:tcPr>
+            <w:tcW w:type="dxa" w:w="1474"/>
+            <w:shd w:fill="2E7D33"/>
+          </w:tcPr>
+          <w:p>
+            <w:pPr>
+              <w:jc w:val="right"/>
+            </w:pPr>
+            <w:r>
+              <w:t>250 Klicks</w:t>
+            </w:r>
+            <w:r>
+              <w:rPr>
+                <w:b/>
+                <w:color w:val="FFFFFF"/>
+                <w:sz w:val="19"/>
+              </w:rPr>
+            </w:r>
+          </w:p>
+        </w:tc>
+      </w:tr>
+      <w:tr>
+        <w:tc>
+          <w:tcPr>
+            <w:tcW w:type="dxa" w:w="3402"/>
+          </w:tcPr>
+          <w:p>
+            <w:r>
+              <w:t>Hauptpreis Kinogutschein</w:t>
+            </w:r>
+            <w:r>
+              <w:rPr>
+                <w:b/>
+                <w:sz w:val="20"/>
+              </w:rPr>
+            </w:r>
+          </w:p>
+        </w:tc>
+        <w:tc>
+          <w:tcPr>
+            <w:tcW w:type="dxa" w:w="1587"/>
+          </w:tcPr>
+          <w:p>
+            <w:pPr>
+              <w:jc w:val="right"/>
+            </w:pPr>
+            <w:r>
+              <w:t>1</w:t>
+            </w:r>
+            <w:r>
+              <w:rPr>
+                <w:sz w:val="20"/>
+              </w:rPr>
+            </w:r>
+          </w:p>
+        </w:tc>
+        <w:tc>
+          <w:tcPr>
+            <w:tcW w:type="dxa" w:w="1474"/>
+          </w:tcPr>
+          <w:p>
+            <w:pPr>
+              <w:jc w:val="right"/>
+            </w:pPr>
+            <w:r>
+              <w:t>0</w:t>
+            </w:r>
+            <w:r>
+              <w:rPr>
+                <w:sz w:val="20"/>
+              </w:rPr>
+            </w:r>
+          </w:p>
+        </w:tc>
+        <w:tc>
+          <w:tcPr>
+            <w:tcW w:type="dxa" w:w="1474"/>
+          </w:tcPr>
+          <w:p>
+            <w:pPr>
+              <w:jc w:val="right"/>
+            </w:pPr>
+            <w:r>
+              <w:t>1</w:t>
+            </w:r>
+            <w:r>
+              <w:rPr>
+                <w:sz w:val="20"/>
+              </w:rPr>
+            </w:r>
+          </w:p>
+        </w:tc>
+        <w:tc>
+          <w:tcPr>
+            <w:tcW w:type="dxa" w:w="1474"/>
+          </w:tcPr>
+          <w:p>
+            <w:pPr>
+              <w:jc w:val="right"/>
+            </w:pPr>
+            <w:r>
+              <w:t>1</w:t>
+            </w:r>
+            <w:r>
+              <w:rPr>
+                <w:sz w:val="20"/>
+              </w:rPr>
+            </w:r>
+          </w:p>
+        </w:tc>
+      </w:tr>
+      <w:tr>
+        <w:tc>
+          <w:tcPr>
+            <w:tcW w:type="dxa" w:w="3402"/>
+            <w:shd w:fill="F2F6F2"/>
+          </w:tcPr>
+          <w:p>
+            <w:r>
+              <w:t>Kugelschreiber</w:t>
+            </w:r>
+            <w:r>
+              <w:rPr>
+                <w:b/>
+                <w:sz w:val="20"/>
+              </w:rPr>
+            </w:r>
+          </w:p>
+        </w:tc>
+        <w:tc>
+          <w:tcPr>
+            <w:tcW w:type="dxa" w:w="1587"/>
+            <w:shd w:fill="F2F6F2"/>
+          </w:tcPr>
+          <w:p>
+            <w:pPr>
+              <w:jc w:val="right"/>
+            </w:pPr>
+            <w:r>
+              <w:t>100</w:t>
+            </w:r>
+            <w:r>
+              <w:rPr>
+                <w:sz w:val="20"/>
+              </w:rPr>
+            </w:r>
+          </w:p>
+        </w:tc>
+        <w:tc>
+          <w:tcPr>
+            <w:tcW w:type="dxa" w:w="1474"/>
+            <w:shd w:fill="F2F6F2"/>
+          </w:tcPr>
+          <w:p>
+            <w:pPr>
+              <w:jc w:val="right"/>
+            </w:pPr>
+            <w:r>
+              <w:t>34</w:t>
+            </w:r>
+            <w:r>
+              <w:rPr>
+                <w:sz w:val="20"/>
+              </w:rPr>
+            </w:r>
+          </w:p>
+        </w:tc>
+        <w:tc>
+          <w:tcPr>
+            <w:tcW w:type="dxa" w:w="1474"/>
+            <w:shd w:fill="F2F6F2"/>
+          </w:tcPr>
+          <w:p>
+            <w:pPr>
+              <w:jc w:val="right"/>
+            </w:pPr>
+            <w:r>
+              <w:t>50</w:t>
+            </w:r>
+            <w:r>
+              <w:rPr>
+                <w:sz w:val="20"/>
+              </w:rPr>
+            </w:r>
+          </w:p>
+        </w:tc>
+        <w:tc>
+          <w:tcPr>
+            <w:tcW w:type="dxa" w:w="1474"/>
+            <w:shd w:fill="F2F6F2"/>
+          </w:tcPr>
+          <w:p>
+            <w:pPr>
+              <w:jc w:val="right"/>
+            </w:pPr>
+            <w:r>
+              <w:t>76</w:t>
+            </w:r>
+            <w:r>
+              <w:rPr>
+                <w:sz w:val="20"/>
+              </w:rPr>
+            </w:r>
+          </w:p>
+        </w:tc>
+      </w:tr>
+      <w:tr>
+        <w:tc>
+          <w:tcPr>
+            <w:tcW w:type="dxa" w:w="3402"/>
+          </w:tcPr>
+          <w:p>
+            <w:r>
+              <w:t>Trinkflasche</w:t>
+            </w:r>
+            <w:r>
+              <w:rPr>
+                <w:b/>
+                <w:sz w:val="20"/>
+              </w:rPr>
+            </w:r>
+          </w:p>
+        </w:tc>
+        <w:tc>
+          <w:tcPr>
+            <w:tcW w:type="dxa" w:w="1587"/>
+          </w:tcPr>
+          <w:p>
+            <w:pPr>
+              <w:jc w:val="right"/>
+            </w:pPr>
+            <w:r>
+              <w:t>50</w:t>
+            </w:r>
+            <w:r>
+              <w:rPr>
+                <w:sz w:val="20"/>
+              </w:rPr>
+            </w:r>
+          </w:p>
+        </w:tc>
+        <w:tc>
+          <w:tcPr>
+            <w:tcW w:type="dxa" w:w="1474"/>
+          </w:tcPr>
+          <w:p>
+            <w:pPr>
+              <w:jc w:val="right"/>
+            </w:pPr>
+            <w:r>
+              <w:t>17</w:t>
+            </w:r>
+            <w:r>
+              <w:rPr>
+                <w:sz w:val="20"/>
+              </w:rPr>
+            </w:r>
+          </w:p>
+        </w:tc>
+        <w:tc>
+          <w:tcPr>
+            <w:tcW w:type="dxa" w:w="1474"/>
+          </w:tcPr>
+          <w:p>
+            <w:pPr>
+              <w:jc w:val="right"/>
+            </w:pPr>
+            <w:r>
+              <w:t>24</w:t>
+            </w:r>
+            <w:r>
+              <w:rPr>
+                <w:sz w:val="20"/>
+              </w:rPr>
+            </w:r>
+          </w:p>
+        </w:tc>
+        <w:tc>
+          <w:tcPr>
+            <w:tcW w:type="dxa" w:w="1474"/>
+          </w:tcPr>
+          <w:p>
+            <w:pPr>
+              <w:jc w:val="right"/>
+            </w:pPr>
+            <w:r>
+              <w:t>38</w:t>
+            </w:r>
+            <w:r>
+              <w:rPr>
+                <w:sz w:val="20"/>
+              </w:rPr>
+            </w:r>
+          </w:p>
+        </w:tc>
+      </w:tr>
+      <w:tr>
+        <w:tc>
+          <w:tcPr>
+            <w:tcW w:type="dxa" w:w="3402"/>
+            <w:shd w:fill="F2F6F2"/>
+          </w:tcPr>
+          <w:p>
+            <w:r>
+              <w:t>Kühl-/Wärme-Pad</w:t>
+            </w:r>
+            <w:r>
+              <w:rPr>
+                <w:b/>
+                <w:sz w:val="20"/>
+              </w:rPr>
+            </w:r>
+          </w:p>
+        </w:tc>
+        <w:tc>
+          <w:tcPr>
+            <w:tcW w:type="dxa" w:w="1587"/>
+            <w:shd w:fill="F2F6F2"/>
+          </w:tcPr>
+          <w:p>
+            <w:pPr>
+              <w:jc w:val="right"/>
+            </w:pPr>
+            <w:r>
+              <w:t>50</w:t>
+            </w:r>
+            <w:r>
+              <w:rPr>
+                <w:sz w:val="20"/>
+              </w:rPr>
+            </w:r>
+          </w:p>
+        </w:tc>
+        <w:tc>
+          <w:tcPr>
+            <w:tcW w:type="dxa" w:w="1474"/>
+            <w:shd w:fill="F2F6F2"/>
+          </w:tcPr>
+          <w:p>
+            <w:pPr>
+              <w:jc w:val="right"/>
+            </w:pPr>
+            <w:r>
+              <w:t>17</w:t>
+            </w:r>
+            <w:r>
+              <w:rPr>
+                <w:sz w:val="20"/>
+              </w:rPr>
+            </w:r>
+          </w:p>
+        </w:tc>
+        <w:tc>
+          <w:tcPr>
+            <w:tcW w:type="dxa" w:w="1474"/>
+            <w:shd w:fill="F2F6F2"/>
+          </w:tcPr>
+          <w:p>
+            <w:pPr>
+              <w:jc w:val="right"/>
+            </w:pPr>
+            <w:r>
+              <w:t>25</w:t>
+            </w:r>
+            <w:r>
+              <w:rPr>
+                <w:sz w:val="20"/>
+              </w:rPr>
+            </w:r>
+          </w:p>
+        </w:tc>
+        <w:tc>
+          <w:tcPr>
+            <w:tcW w:type="dxa" w:w="1474"/>
+            <w:shd w:fill="F2F6F2"/>
+          </w:tcPr>
+          <w:p>
+            <w:pPr>
+              <w:jc w:val="right"/>
+            </w:pPr>
+            <w:r>
+              <w:t>38</w:t>
+            </w:r>
+            <w:r>
+              <w:rPr>
+                <w:sz w:val="20"/>
+              </w:rPr>
+            </w:r>
+          </w:p>
+        </w:tc>
+      </w:tr>
+      <w:tr>
+        <w:tc>
+          <w:tcPr>
+            <w:tcW w:type="dxa" w:w="3402"/>
+          </w:tcPr>
+          <w:p>
+            <w:r>
+              <w:t>GreenTEA</w:t>
+            </w:r>
+            <w:r>
+              <w:rPr>
+                <w:b/>
+                <w:sz w:val="20"/>
+              </w:rPr>
+            </w:r>
+          </w:p>
+        </w:tc>
+        <w:tc>
+          <w:tcPr>
+            <w:tcW w:type="dxa" w:w="1587"/>
+          </w:tcPr>
+          <w:p>
+            <w:pPr>
+              <w:jc w:val="right"/>
+            </w:pPr>
+            <w:r>
+              <w:t>unbegrenzt</w:t>
+            </w:r>
+            <w:r>
+              <w:rPr>
+                <w:sz w:val="20"/>
+              </w:rPr>
+            </w:r>
+          </w:p>
+        </w:tc>
+        <w:tc>
+          <w:tcPr>
+            <w:tcW w:type="dxa" w:w="1474"/>
+          </w:tcPr>
+          <w:p>
+            <w:pPr>
+              <w:jc w:val="right"/>
+            </w:pPr>
+            <w:r>
+              <w:t>21</w:t>
+            </w:r>
+            <w:r>
+              <w:rPr>
+                <w:sz w:val="20"/>
+              </w:rPr>
+            </w:r>
+          </w:p>
+        </w:tc>
+        <w:tc>
+          <w:tcPr>
+            <w:tcW w:type="dxa" w:w="1474"/>
+          </w:tcPr>
+          <w:p>
+            <w:pPr>
+              <w:jc w:val="right"/>
+            </w:pPr>
+            <w:r>
+              <w:t>34</w:t>
+            </w:r>
+            <w:r>
+              <w:rPr>
+                <w:sz w:val="20"/>
+              </w:rPr>
+            </w:r>
+          </w:p>
+        </w:tc>
+        <w:tc>
+          <w:tcPr>
+            <w:tcW w:type="dxa" w:w="1474"/>
+          </w:tcPr>
+          <w:p>
+            <w:pPr>
+              <w:jc w:val="right"/>
+            </w:pPr>
+            <w:r>
+              <w:t>72</w:t>
+            </w:r>
+            <w:r>
+              <w:rPr>
+                <w:sz w:val="20"/>
+              </w:rPr>
+            </w:r>
+          </w:p>
+        </w:tc>
+      </w:tr>
+      <w:tr>
+        <w:tc>
+          <w:tcPr>
+            <w:tcW w:type="dxa" w:w="3402"/>
+            <w:shd w:fill="F2F6F2"/>
+          </w:tcPr>
+          <w:p>
+            <w:r>
+              <w:t>Niete</w:t>
+            </w:r>
+            <w:r>
+              <w:rPr>
+                <w:b/>
+                <w:sz w:val="20"/>
+              </w:rPr>
+            </w:r>
+          </w:p>
+        </w:tc>
+        <w:tc>
+          <w:tcPr>
+            <w:tcW w:type="dxa" w:w="1587"/>
+            <w:shd w:fill="F2F6F2"/>
+          </w:tcPr>
+          <w:p>
+            <w:pPr>
+              <w:jc w:val="right"/>
+            </w:pPr>
+            <w:r>
+              <w:t>–</w:t>
+            </w:r>
+            <w:r>
+              <w:rPr>
+                <w:sz w:val="20"/>
+              </w:rPr>
+            </w:r>
+          </w:p>
+        </w:tc>
+        <w:tc>
+          <w:tcPr>
+            <w:tcW w:type="dxa" w:w="1474"/>
+            <w:shd w:fill="F2F6F2"/>
+          </w:tcPr>
+          <w:p>
+            <w:pPr>
+              <w:jc w:val="right"/>
+            </w:pPr>
+            <w:r>
+              <w:t>10</w:t>
+            </w:r>
+            <w:r>
+              <w:rPr>
+                <w:sz w:val="20"/>
+              </w:rPr>
+            </w:r>
+          </w:p>
+        </w:tc>
+        <w:tc>
+          <w:tcPr>
+            <w:tcW w:type="dxa" w:w="1474"/>
+            <w:shd w:fill="F2F6F2"/>
+          </w:tcPr>
+          <w:p>
+            <w:pPr>
+              <w:jc w:val="right"/>
+            </w:pPr>
+            <w:r>
+              <w:t>15</w:t>
+            </w:r>
+            <w:r>
+              <w:rPr>
+                <w:sz w:val="20"/>
+              </w:rPr>
+            </w:r>
+          </w:p>
+        </w:tc>
+        <w:tc>
+          <w:tcPr>
+            <w:tcW w:type="dxa" w:w="1474"/>
+            <w:shd w:fill="F2F6F2"/>
+          </w:tcPr>
+          <w:p>
+            <w:pPr>
+              <w:jc w:val="right"/>
+            </w:pPr>
+            <w:r>
+              <w:t>25</w:t>
+            </w:r>
+            <w:r>
+              <w:rPr>
+                <w:sz w:val="20"/>
+              </w:rPr>
             </w:r>
           </w:p>
         </w:tc>
@@ -2089,7 +2851,7 @@
           <w:i w:val="0"/>
           <w:sz w:val="21"/>
         </w:rPr>
-        <w:t>Pro Messetag wird genau ein Gutschein ausgespielt. Dafür gelten drei Regeln:</w:t>
+        <w:t>Pro Messetag wird genau ein Gutschein ausgespielt – vorausgesetzt, es kommen an diesem Tag genügend Drehungen zusammen. Dafür gelten drei Regeln:</w:t>
       </w:r>
     </w:p>
     <w:p>
@@ -2101,7 +2863,7 @@
         <w:rPr>
           <w:sz w:val="21"/>
         </w:rPr>
-        <w:t>Er ist für die ersten 150 Drehungen eines Tages gesperrt. Frühestens der 151. Klick auf den Buzzer kann ihn auslösen.</w:t>
+        <w:t>Er ist am Anfang jedes Tages gesperrt. Wie lange, richtet sich nach der Öffnungsdauer: Am Freitag ist die Ausstellung nur vier Stunden offen, am Samstag elf. Die Sperren stehen in der Tabelle unten.</w:t>
       </w:r>
     </w:p>
     <w:p>
@@ -2113,7 +2875,7 @@
         <w:rPr>
           <w:sz w:val="21"/>
         </w:rPr>
-        <w:t>Danach fällt er zufällig gestreut, mit 20 Prozent Wahrscheinlichkeit je Klick – im Mittel beim 155. Klick, mal früher, mal später. Damit kann niemand mitzählen, wann er an der Reihe ist.</w:t>
+        <w:t>Danach fällt er zufällig gestreut, mit 20 Prozent Wahrscheinlichkeit je Klick – im Mittel etwa fünf Klicks nach dem Ende der Sperre, mal früher, mal später. Damit kann niemand mitzählen, wann er an der Reihe ist.</w:t>
       </w:r>
     </w:p>
     <w:p>
@@ -2125,7 +2887,7 @@
         <w:rPr>
           <w:sz w:val="21"/>
         </w:rPr>
-        <w:t>Kommen an einem Tag weniger als 151 Klicks zusammen, wird an diesem Tag kein Gutschein ausgespielt. Er wandert nicht auf den nächsten Tag.</w:t>
+        <w:t>Kommen an einem Tag weniger Drehungen zusammen, als die Sperre verlangt, wird an diesem Tag kein Gutschein ausgespielt. Er wandert nicht auf den nächsten Tag.</w:t>
       </w:r>
     </w:p>
     <w:p>
@@ -2137,7 +2899,7 @@
           <w:i w:val="0"/>
           <w:sz w:val="21"/>
         </w:rPr>
-        <w:t>Nachgemessen am fertigen Rad:</w:t>
+        <w:t>Sperre je Messetag, nachgemessen am fertigen Rad:</w:t>
       </w:r>
     </w:p>
     <w:tbl>
@@ -2145,65 +2907,88 @@
         <w:tblStyle w:val="TableGrid"/>
         <w:tblW w:type="auto" w:w="0"/>
         <w:jc w:val="left"/>
+        <w:tblLayout w:type="fixed"/>
         <w:tblLook w:firstColumn="1" w:firstRow="1" w:lastColumn="0" w:lastRow="0" w:noHBand="0" w:noVBand="1" w:val="04A0"/>
       </w:tblPr>
       <w:tblGrid>
-        <w:gridCol w:w="3249"/>
-        <w:gridCol w:w="3249"/>
-        <w:gridCol w:w="3249"/>
+        <w:gridCol w:w="1474"/>
+        <w:gridCol w:w="1701"/>
+        <w:gridCol w:w="2608"/>
+        <w:gridCol w:w="3969"/>
       </w:tblGrid>
       <w:tr>
         <w:tc>
           <w:tcPr>
-            <w:tcW w:type="dxa" w:w="3175"/>
+            <w:tcW w:type="dxa" w:w="1474"/>
             <w:shd w:fill="2E7D33"/>
           </w:tcPr>
           <w:p>
-            <w:r/>
+            <w:r>
+              <w:t>Messetag</w:t>
+            </w:r>
             <w:r>
               <w:rPr>
                 <w:b/>
                 <w:color w:val="FFFFFF"/>
                 <w:sz w:val="19"/>
               </w:rPr>
-              <w:t>Stand des Zählers</w:t>
             </w:r>
           </w:p>
         </w:tc>
         <w:tc>
           <w:tcPr>
-            <w:tcW w:type="dxa" w:w="2835"/>
+            <w:tcW w:type="dxa" w:w="1701"/>
             <w:shd w:fill="2E7D33"/>
           </w:tcPr>
           <w:p>
             <w:pPr>
               <w:jc w:val="right"/>
             </w:pPr>
-            <w:r/>
+            <w:r>
+              <w:t>Ausstellung</w:t>
+            </w:r>
             <w:r>
               <w:rPr>
                 <w:b/>
                 <w:color w:val="FFFFFF"/>
                 <w:sz w:val="19"/>
               </w:rPr>
-              <w:t>Hauptpreis in 300 Zügen</w:t>
             </w:r>
           </w:p>
         </w:tc>
         <w:tc>
           <w:tcPr>
-            <w:tcW w:type="dxa" w:w="3402"/>
+            <w:tcW w:type="dxa" w:w="2608"/>
             <w:shd w:fill="2E7D33"/>
           </w:tcPr>
           <w:p>
-            <w:r/>
+            <w:r>
+              <w:t>Gutschein frühestens ab</w:t>
+            </w:r>
             <w:r>
               <w:rPr>
                 <w:b/>
                 <w:color w:val="FFFFFF"/>
                 <w:sz w:val="19"/>
               </w:rPr>
-              <w:t>Bedeutung</w:t>
+            </w:r>
+          </w:p>
+        </w:tc>
+        <w:tc>
+          <w:tcPr>
+            <w:tcW w:type="dxa" w:w="3969"/>
+            <w:shd w:fill="2E7D33"/>
+          </w:tcPr>
+          <w:p>
+            <w:r>
+              <w:t>Nachgemessen (je 300 Züge)</w:t>
+            </w:r>
+            <w:r>
+              <w:rPr>
+                <w:b/>
+                <w:color w:val="FFFFFF"/>
+                <w:sz w:val="19"/>
+              </w:rPr>
             </w:r>
           </w:p>
         </w:tc>
@@ -2211,47 +2996,68 @@
       <w:tr>
         <w:tc>
           <w:tcPr>
-            <w:tcW w:type="dxa" w:w="3175"/>
+            <w:tcW w:type="dxa" w:w="1474"/>
           </w:tcPr>
           <w:p>
-            <w:r/>
+            <w:r>
+              <w:t>Freitag</w:t>
+            </w:r>
             <w:r>
               <w:rPr>
                 <w:b/>
                 <w:sz w:val="20"/>
               </w:rPr>
-              <w:t>149 (der 150. Klick läuft)</w:t>
             </w:r>
           </w:p>
         </w:tc>
         <w:tc>
           <w:tcPr>
-            <w:tcW w:type="dxa" w:w="2835"/>
+            <w:tcW w:type="dxa" w:w="1701"/>
           </w:tcPr>
           <w:p>
             <w:pPr>
               <w:jc w:val="right"/>
             </w:pPr>
-            <w:r/>
+            <w:r>
+              <w:t>17–21 Uhr</w:t>
+            </w:r>
             <w:r>
               <w:rPr>
                 <w:sz w:val="20"/>
               </w:rPr>
-              <w:t>0</w:t>
             </w:r>
           </w:p>
         </w:tc>
         <w:tc>
           <w:tcPr>
-            <w:tcW w:type="dxa" w:w="3402"/>
+            <w:tcW w:type="dxa" w:w="2608"/>
           </w:tcPr>
           <w:p>
-            <w:r/>
+            <w:r>
+              <w:t>dem 61. Klick</w:t>
+            </w:r>
             <w:r>
               <w:rPr>
                 <w:sz w:val="20"/>
               </w:rPr>
-              <w:t>gesperrt, kommt nicht vor</w:t>
+            </w:r>
+          </w:p>
+        </w:tc>
+        <w:tc>
+          <w:tcPr>
+            <w:tcW w:type="dxa" w:w="3969"/>
+          </w:tcPr>
+          <w:p>
+            <w:pPr>
+              <w:jc w:val="right"/>
+            </w:pPr>
+            <w:r>
+              <w:t>Klick 60: nie · Klick 61: 17 %</w:t>
+            </w:r>
+            <w:r>
+              <w:rPr>
+                <w:sz w:val="20"/>
+              </w:rPr>
             </w:r>
           </w:p>
         </w:tc>
@@ -2259,50 +3065,143 @@
       <w:tr>
         <w:tc>
           <w:tcPr>
-            <w:tcW w:type="dxa" w:w="3175"/>
+            <w:tcW w:type="dxa" w:w="1474"/>
             <w:shd w:fill="F2F6F2"/>
           </w:tcPr>
           <w:p>
-            <w:r/>
+            <w:r>
+              <w:t>Samstag</w:t>
+            </w:r>
             <w:r>
               <w:rPr>
                 <w:b/>
                 <w:sz w:val="20"/>
               </w:rPr>
-              <w:t>150 (der 151. Klick läuft)</w:t>
             </w:r>
           </w:p>
         </w:tc>
         <w:tc>
           <w:tcPr>
-            <w:tcW w:type="dxa" w:w="2835"/>
+            <w:tcW w:type="dxa" w:w="1701"/>
             <w:shd w:fill="F2F6F2"/>
           </w:tcPr>
           <w:p>
             <w:pPr>
               <w:jc w:val="right"/>
             </w:pPr>
-            <w:r/>
+            <w:r>
+              <w:t>10–21 Uhr</w:t>
+            </w:r>
             <w:r>
               <w:rPr>
                 <w:sz w:val="20"/>
               </w:rPr>
-              <w:t>65  (22 %)</w:t>
             </w:r>
           </w:p>
         </w:tc>
         <w:tc>
           <w:tcPr>
-            <w:tcW w:type="dxa" w:w="3402"/>
+            <w:tcW w:type="dxa" w:w="2608"/>
             <w:shd w:fill="F2F6F2"/>
           </w:tcPr>
           <w:p>
-            <w:r/>
+            <w:r>
+              <w:t>dem 151. Klick</w:t>
+            </w:r>
             <w:r>
               <w:rPr>
                 <w:sz w:val="20"/>
               </w:rPr>
-              <w:t>freigegeben, gestreut</w:t>
+            </w:r>
+          </w:p>
+        </w:tc>
+        <w:tc>
+          <w:tcPr>
+            <w:tcW w:type="dxa" w:w="3969"/>
+          </w:tcPr>
+          <w:p>
+            <w:pPr>
+              <w:jc w:val="right"/>
+            </w:pPr>
+            <w:r>
+              <w:t>Klick 150: nie · Klick 151: 16 %</w:t>
+            </w:r>
+            <w:r>
+              <w:rPr>
+                <w:sz w:val="20"/>
+              </w:rPr>
+            </w:r>
+          </w:p>
+        </w:tc>
+      </w:tr>
+      <w:tr>
+        <w:tc>
+          <w:tcPr>
+            <w:tcW w:type="dxa" w:w="1474"/>
+          </w:tcPr>
+          <w:p>
+            <w:r>
+              <w:t>Sonntag</w:t>
+            </w:r>
+            <w:r>
+              <w:rPr>
+                <w:b/>
+                <w:sz w:val="20"/>
+              </w:rPr>
+            </w:r>
+          </w:p>
+        </w:tc>
+        <w:tc>
+          <w:tcPr>
+            <w:tcW w:type="dxa" w:w="1701"/>
+          </w:tcPr>
+          <w:p>
+            <w:pPr>
+              <w:jc w:val="right"/>
+            </w:pPr>
+            <w:r>
+              <w:t>10–17 Uhr</w:t>
+            </w:r>
+            <w:r>
+              <w:rPr>
+                <w:sz w:val="20"/>
+              </w:rPr>
+            </w:r>
+          </w:p>
+        </w:tc>
+        <w:tc>
+          <w:tcPr>
+            <w:tcW w:type="dxa" w:w="2608"/>
+          </w:tcPr>
+          <w:p>
+            <w:pPr>
+              <w:jc w:val="right"/>
+            </w:pPr>
+            <w:r>
+              <w:t>dem 101. Klick</w:t>
+            </w:r>
+            <w:r>
+              <w:rPr>
+                <w:sz w:val="20"/>
+              </w:rPr>
+            </w:r>
+          </w:p>
+        </w:tc>
+        <w:tc>
+          <w:tcPr>
+            <w:tcW w:type="dxa" w:w="3969"/>
+          </w:tcPr>
+          <w:p>
+            <w:pPr>
+              <w:jc w:val="right"/>
+            </w:pPr>
+            <w:r>
+              <w:t>Klick 100: nie · Klick 101: 19 %</w:t>
+            </w:r>
+            <w:r>
+              <w:rPr>
+                <w:sz w:val="20"/>
+              </w:rPr>
             </w:r>
           </w:p>
         </w:tc>
@@ -2489,6 +3388,31 @@
           <w:sz w:val="21"/>
         </w:rPr>
         <w:t>revolutionscreen-web.github.io/bruesch/glueckrad/index.html</w:t>
+      </w:r>
+    </w:p>
+    <w:p>
+      <w:pPr>
+        <w:spacing w:after="80"/>
+      </w:pPr>
+      <w:r>
+        <w:rPr>
+          <w:i w:val="0"/>
+          <w:sz w:val="21"/>
+        </w:rPr>
+        <w:t>Dieselbe Anzeige für einen Beamer oder zweiten Bildschirm (dreht gleichzeitig mit, ohne Bedienung):</w:t>
+      </w:r>
+    </w:p>
+    <w:p>
+      <w:pPr>
+        <w:spacing w:after="200"/>
+      </w:pPr>
+      <w:r>
+        <w:rPr>
+          <w:b/>
+          <w:color w:val="2E7D33"/>
+          <w:sz w:val="21"/>
+        </w:rPr>
+        <w:t>revolutionscreen-web.github.io/bruesch/glueckrad/index.html?zuschauer=1</w:t>
       </w:r>
     </w:p>
     <w:sectPr>

</xml_diff>